<commit_message>
contrato de indeferimento: substitui adaptacao pelo texto OFICIAL do Juvenill
Modelo enviado na integra (verbatim): clausula 1.3 Finalidade do recurso com
as 4 hipoteses de decisao, 1.4 servicos nao compreendidos (10 itens, inclui
aquisicao/cessao de anterioridade e acordo de coexistencia), 4.3 encerramento
sem contratacao automatica de medida posterior, 6.3 fatos supervenientes.

Co-Authored-By: Claude Opus 4.8 <noreply@anthropic.com>
</commit_message>
<xml_diff>
--- a/admin/tpl/contrato-indeferimento.docx
+++ b/admin/tpl/contrato-indeferimento.docx
@@ -27,7 +27,7 @@
           <w:sz w:val="24"/>
           <w:szCs w:val="24"/>
         </w:rPr>
-        <w:t xml:space="preserve">RECURSO CONTRA INDEFERIMENTO PERANTE O INPI</w:t>
+        <w:t xml:space="preserve">RECURSO CONTRA INDEFERIMENTO DE PEDIDO DE REGISTRO DE MARCA – INPI</w:t>
       </w:r>
     </w:p>
     <w:p>
@@ -51,10 +51,33 @@
       </w:pPr>
       <w:r>
         <w:rPr>
-          <w:sz w:val="22"/>
-          <w:szCs w:val="22"/>
-        </w:rPr>
-        <w:t xml:space="preserve">{{CLIENTE_MAI}}, {{QUALIFICACAO}}, doravante denominada CONTRATANTE.</w:t>
+          <w:b/>
+          <w:sz w:val="22"/>
+          <w:szCs w:val="22"/>
+        </w:rPr>
+        <w:t xml:space="preserve">{{CLIENTE_MAI}}</w:t>
+      </w:r>
+      <w:r>
+        <w:rPr>
+          <w:sz w:val="22"/>
+          <w:szCs w:val="22"/>
+        </w:rPr>
+        <w:t xml:space="preserve">, {{QUALIFICACAO}}, doravante denominado(a) </w:t>
+      </w:r>
+      <w:r>
+        <w:rPr>
+          <w:b/>
+          <w:sz w:val="22"/>
+          <w:szCs w:val="22"/>
+        </w:rPr>
+        <w:t xml:space="preserve">CONTRATANTE</w:t>
+      </w:r>
+      <w:r>
+        <w:rPr>
+          <w:sz w:val="22"/>
+          <w:szCs w:val="22"/>
+        </w:rPr>
+        <w:t xml:space="preserve">.</w:t>
       </w:r>
     </w:p>
     <w:p>
@@ -78,10 +101,93 @@
       </w:pPr>
       <w:r>
         <w:rPr>
-          <w:sz w:val="22"/>
-          <w:szCs w:val="22"/>
-        </w:rPr>
-        <w:t xml:space="preserve">CAMILA DE LIZ PEREIRA RIBEIRO SOCIEDADE INDIVIDUAL DE ADVOCACIA, inscrita no CNPJ sob o nº 56.029.137/0001-23, com escritório profissional à Rua Vergílio Ramos, nº 73, Lages/SC, representada pela advogada Camila de Liz Pereira Ribeiro, inscrita na OAB/SC sob o nº 32.680 e no CPF sob o nº 006.928.439-30, telefone (49) 99974-2477, doravante denominada CONTRATADA.</w:t>
+          <w:b/>
+          <w:sz w:val="22"/>
+          <w:szCs w:val="22"/>
+        </w:rPr>
+        <w:t xml:space="preserve">CAMILA DE LIZ PEREIRA RIBEIRO SOCIEDADE INDIVIDUAL DE ADVOCACIA</w:t>
+      </w:r>
+      <w:r>
+        <w:rPr>
+          <w:sz w:val="22"/>
+          <w:szCs w:val="22"/>
+        </w:rPr>
+        <w:t xml:space="preserve">, inscrita no CNPJ sob o nº </w:t>
+      </w:r>
+      <w:r>
+        <w:rPr>
+          <w:b/>
+          <w:sz w:val="22"/>
+          <w:szCs w:val="22"/>
+        </w:rPr>
+        <w:t xml:space="preserve">56.029.137/0001-23</w:t>
+      </w:r>
+      <w:r>
+        <w:rPr>
+          <w:sz w:val="22"/>
+          <w:szCs w:val="22"/>
+        </w:rPr>
+        <w:t xml:space="preserve">, com escritório profissional à Rua Vergílio Ramos, nº 73, Lages/SC, representada pela advogada </w:t>
+      </w:r>
+      <w:r>
+        <w:rPr>
+          <w:b/>
+          <w:sz w:val="22"/>
+          <w:szCs w:val="22"/>
+        </w:rPr>
+        <w:t xml:space="preserve">Camila de Liz Pereira Ribeiro</w:t>
+      </w:r>
+      <w:r>
+        <w:rPr>
+          <w:sz w:val="22"/>
+          <w:szCs w:val="22"/>
+        </w:rPr>
+        <w:t xml:space="preserve">, inscrita na OAB/SC sob o nº </w:t>
+      </w:r>
+      <w:r>
+        <w:rPr>
+          <w:b/>
+          <w:sz w:val="22"/>
+          <w:szCs w:val="22"/>
+        </w:rPr>
+        <w:t xml:space="preserve">32.680</w:t>
+      </w:r>
+      <w:r>
+        <w:rPr>
+          <w:sz w:val="22"/>
+          <w:szCs w:val="22"/>
+        </w:rPr>
+        <w:t xml:space="preserve">, CPF nº </w:t>
+      </w:r>
+      <w:r>
+        <w:rPr>
+          <w:b/>
+          <w:sz w:val="22"/>
+          <w:szCs w:val="22"/>
+        </w:rPr>
+        <w:t xml:space="preserve">006.928.439-30</w:t>
+      </w:r>
+      <w:r>
+        <w:rPr>
+          <w:sz w:val="22"/>
+          <w:szCs w:val="22"/>
+        </w:rPr>
+        <w:t xml:space="preserve">, telefone (49) 99974-2477, doravante denominada </w:t>
+      </w:r>
+      <w:r>
+        <w:rPr>
+          <w:b/>
+          <w:sz w:val="22"/>
+          <w:szCs w:val="22"/>
+        </w:rPr>
+        <w:t xml:space="preserve">CONTRATADA</w:t>
+      </w:r>
+      <w:r>
+        <w:rPr>
+          <w:sz w:val="22"/>
+          <w:szCs w:val="22"/>
+        </w:rPr>
+        <w:t xml:space="preserve">.</w:t>
       </w:r>
     </w:p>
     <w:p>
@@ -94,7 +200,37 @@
           <w:sz w:val="22"/>
           <w:szCs w:val="22"/>
         </w:rPr>
-        <w:t xml:space="preserve">CONTRATANTE e CONTRATADA, quando mencionadas conjuntamente, serão denominadas “Partes” e, individualmente, “Parte”.</w:t>
+        <w:t xml:space="preserve">CONTRATANTE e CONTRATADA, quando mencionadas conjuntamente, serão denominadas </w:t>
+      </w:r>
+      <w:r>
+        <w:rPr>
+          <w:b/>
+          <w:sz w:val="22"/>
+          <w:szCs w:val="22"/>
+        </w:rPr>
+        <w:t xml:space="preserve">“Partes”</w:t>
+      </w:r>
+      <w:r>
+        <w:rPr>
+          <w:sz w:val="22"/>
+          <w:szCs w:val="22"/>
+        </w:rPr>
+        <w:t xml:space="preserve"> e, individualmente, </w:t>
+      </w:r>
+      <w:r>
+        <w:rPr>
+          <w:b/>
+          <w:sz w:val="22"/>
+          <w:szCs w:val="22"/>
+        </w:rPr>
+        <w:t xml:space="preserve">“Parte”</w:t>
+      </w:r>
+      <w:r>
+        <w:rPr>
+          <w:sz w:val="22"/>
+          <w:szCs w:val="22"/>
+        </w:rPr>
+        <w:t xml:space="preserve">.</w:t>
       </w:r>
     </w:p>
     <w:p>
@@ -107,7 +243,22 @@
           <w:sz w:val="22"/>
           <w:szCs w:val="22"/>
         </w:rPr>
-        <w:t xml:space="preserve">As Partes resolvem celebrar o presente Contrato de Prestação de Serviços e Honorários Profissionais, mediante as cláusulas e condições seguintes.</w:t>
+        <w:t xml:space="preserve">As Partes resolvem celebrar o presente </w:t>
+      </w:r>
+      <w:r>
+        <w:rPr>
+          <w:b/>
+          <w:sz w:val="22"/>
+          <w:szCs w:val="22"/>
+        </w:rPr>
+        <w:t xml:space="preserve">Contrato de Prestação de Serviços e Honorários Profissionais</w:t>
+      </w:r>
+      <w:r>
+        <w:rPr>
+          <w:sz w:val="22"/>
+          <w:szCs w:val="22"/>
+        </w:rPr>
+        <w:t xml:space="preserve">, mediante as cláusulas e condições seguintes.</w:t>
       </w:r>
     </w:p>
     <w:p>
@@ -148,7 +299,67 @@
           <w:sz w:val="22"/>
           <w:szCs w:val="22"/>
         </w:rPr>
-        <w:t xml:space="preserve">A CONTRATADA obriga-se, mediante o mandato que lhe for outorgado pela CONTRATANTE, a prestar serviços profissionais destinados à análise, elaboração e apresentação de recurso contra a decisão de indeferimento proferida no pedido de registro da marca “{{MARCA}}”, processo nº {{PROCESSO}}, em trâmite perante o Instituto Nacional da Propriedade Industrial – INPI.</w:t>
+        <w:t xml:space="preserve">A CONTRATADA obriga-se, mediante o mandato que lhe for outorgado pela CONTRATANTE, a prestar serviços profissionais destinados à </w:t>
+      </w:r>
+      <w:r>
+        <w:rPr>
+          <w:b/>
+          <w:sz w:val="22"/>
+          <w:szCs w:val="22"/>
+        </w:rPr>
+        <w:t xml:space="preserve">análise, elaboração e apresentação de recurso administrativo contra a decisão de indeferimento</w:t>
+      </w:r>
+      <w:r>
+        <w:rPr>
+          <w:sz w:val="22"/>
+          <w:szCs w:val="22"/>
+        </w:rPr>
+        <w:t xml:space="preserve"> do pedido de registro da marca </w:t>
+      </w:r>
+      <w:r>
+        <w:rPr>
+          <w:b/>
+          <w:sz w:val="22"/>
+          <w:szCs w:val="22"/>
+        </w:rPr>
+        <w:t xml:space="preserve">“{{MARCA}}”</w:t>
+      </w:r>
+      <w:r>
+        <w:rPr>
+          <w:sz w:val="22"/>
+          <w:szCs w:val="22"/>
+        </w:rPr>
+        <w:t xml:space="preserve">, processo nº </w:t>
+      </w:r>
+      <w:r>
+        <w:rPr>
+          <w:b/>
+          <w:sz w:val="22"/>
+          <w:szCs w:val="22"/>
+        </w:rPr>
+        <w:t xml:space="preserve">{{PROCESSO}}</w:t>
+      </w:r>
+      <w:r>
+        <w:rPr>
+          <w:sz w:val="22"/>
+          <w:szCs w:val="22"/>
+        </w:rPr>
+        <w:t xml:space="preserve">, em trâmite perante o </w:t>
+      </w:r>
+      <w:r>
+        <w:rPr>
+          <w:b/>
+          <w:sz w:val="22"/>
+          <w:szCs w:val="22"/>
+        </w:rPr>
+        <w:t xml:space="preserve">Instituto Nacional da Propriedade Industrial – INPI</w:t>
+      </w:r>
+      <w:r>
+        <w:rPr>
+          <w:sz w:val="22"/>
+          <w:szCs w:val="22"/>
+        </w:rPr>
+        <w:t xml:space="preserve">.</w:t>
       </w:r>
     </w:p>
     <w:p>
@@ -189,119 +400,190 @@
           <w:sz w:val="22"/>
           <w:szCs w:val="22"/>
         </w:rPr>
-        <w:t xml:space="preserve">a) análise do pedido de registro e dos fundamentos da decisão de indeferimento proferida pelo INPI;</w:t>
-      </w:r>
-    </w:p>
-    <w:p>
-      <w:pPr>
-        <w:jc w:val="both"/>
-        <w:ind w:left="340"/>
-        <w:spacing w:after="90" w:line="276" w:lineRule="auto"/>
-      </w:pPr>
-      <w:r>
-        <w:rPr>
-          <w:sz w:val="22"/>
-          <w:szCs w:val="22"/>
-        </w:rPr>
-        <w:t xml:space="preserve">b) análise das marcas ou impedimentos eventualmente apontados como causa do indeferimento;</w:t>
-      </w:r>
-    </w:p>
-    <w:p>
-      <w:pPr>
-        <w:jc w:val="both"/>
-        <w:ind w:left="340"/>
-        <w:spacing w:after="90" w:line="276" w:lineRule="auto"/>
-      </w:pPr>
-      <w:r>
-        <w:rPr>
-          <w:sz w:val="22"/>
-          <w:szCs w:val="22"/>
-        </w:rPr>
-        <w:t xml:space="preserve">c) análise dos documentos e informações disponibilizados pela CONTRATANTE;</w:t>
-      </w:r>
-    </w:p>
-    <w:p>
-      <w:pPr>
-        <w:jc w:val="both"/>
-        <w:ind w:left="340"/>
-        <w:spacing w:after="90" w:line="276" w:lineRule="auto"/>
-      </w:pPr>
-      <w:r>
-        <w:rPr>
-          <w:sz w:val="22"/>
-          <w:szCs w:val="22"/>
-        </w:rPr>
-        <w:t xml:space="preserve">d) definição da estratégia administrativa considerada juridicamente adequada ao caso;</w:t>
-      </w:r>
-    </w:p>
-    <w:p>
-      <w:pPr>
-        <w:jc w:val="both"/>
-        <w:ind w:left="340"/>
-        <w:spacing w:after="90" w:line="276" w:lineRule="auto"/>
-      </w:pPr>
-      <w:r>
-        <w:rPr>
-          <w:sz w:val="22"/>
-          <w:szCs w:val="22"/>
-        </w:rPr>
-        <w:t xml:space="preserve">e) elaboração das razões de recurso;</w:t>
-      </w:r>
-    </w:p>
-    <w:p>
-      <w:pPr>
-        <w:jc w:val="both"/>
-        <w:ind w:left="340"/>
-        <w:spacing w:after="90" w:line="276" w:lineRule="auto"/>
-      </w:pPr>
-      <w:r>
-        <w:rPr>
-          <w:sz w:val="22"/>
-          <w:szCs w:val="22"/>
-        </w:rPr>
-        <w:t xml:space="preserve">f) protocolo do recurso perante o INPI, dentro do prazo legal aplicável, desde que a CONTRATANTE forneça tempestivamente todos os documentos, informações e valores necessários;</w:t>
-      </w:r>
-    </w:p>
-    <w:p>
-      <w:pPr>
-        <w:jc w:val="both"/>
-        <w:ind w:left="340"/>
-        <w:spacing w:after="90" w:line="276" w:lineRule="auto"/>
-      </w:pPr>
-      <w:r>
-        <w:rPr>
-          <w:sz w:val="22"/>
-          <w:szCs w:val="22"/>
-        </w:rPr>
-        <w:t xml:space="preserve">g) acompanhamento administrativo do processo após a apresentação do recurso, até que haja decisão do INPI, observados os limites previstos neste contrato;</w:t>
-      </w:r>
-    </w:p>
-    <w:p>
-      <w:pPr>
-        <w:jc w:val="both"/>
-        <w:ind w:left="340"/>
-        <w:spacing w:after="90" w:line="276" w:lineRule="auto"/>
-      </w:pPr>
-      <w:r>
-        <w:rPr>
-          <w:sz w:val="22"/>
-          <w:szCs w:val="22"/>
-        </w:rPr>
-        <w:t xml:space="preserve">h) comunicação à CONTRATANTE acerca de movimentações relevantes identificadas durante o acompanhamento.</w:t>
-      </w:r>
-    </w:p>
-    <w:p>
-      <w:pPr>
-        <w:jc w:val="both"/>
-        <w:spacing w:after="90" w:line="276" w:lineRule="auto"/>
-      </w:pPr>
-      <w:r>
-        <w:rPr>
-          <w:b/>
-          <w:sz w:val="22"/>
-          <w:szCs w:val="22"/>
-        </w:rPr>
-        <w:t xml:space="preserve">1.3. Limites da contratação</w:t>
+        <w:t xml:space="preserve">a) análise do processo administrativo e da decisão de indeferimento publicada pelo INPI;</w:t>
+      </w:r>
+    </w:p>
+    <w:p>
+      <w:pPr>
+        <w:jc w:val="both"/>
+        <w:ind w:left="340"/>
+        <w:spacing w:after="90" w:line="276" w:lineRule="auto"/>
+      </w:pPr>
+      <w:r>
+        <w:rPr>
+          <w:sz w:val="22"/>
+          <w:szCs w:val="22"/>
+        </w:rPr>
+        <w:t xml:space="preserve">b) análise dos fundamentos legais e técnicos utilizados pelo INPI para o indeferimento;</w:t>
+      </w:r>
+    </w:p>
+    <w:p>
+      <w:pPr>
+        <w:jc w:val="both"/>
+        <w:ind w:left="340"/>
+        <w:spacing w:after="90" w:line="276" w:lineRule="auto"/>
+      </w:pPr>
+      <w:r>
+        <w:rPr>
+          <w:sz w:val="22"/>
+          <w:szCs w:val="22"/>
+        </w:rPr>
+        <w:t xml:space="preserve">c) pesquisa das anterioridades, marcas, processos, decisões e demais elementos considerados pertinentes à elaboração da estratégia recursal;</w:t>
+      </w:r>
+    </w:p>
+    <w:p>
+      <w:pPr>
+        <w:jc w:val="both"/>
+        <w:ind w:left="340"/>
+        <w:spacing w:after="90" w:line="276" w:lineRule="auto"/>
+      </w:pPr>
+      <w:r>
+        <w:rPr>
+          <w:sz w:val="22"/>
+          <w:szCs w:val="22"/>
+        </w:rPr>
+        <w:t xml:space="preserve">d) análise dos documentos e informações fornecidos pela CONTRATANTE;</w:t>
+      </w:r>
+    </w:p>
+    <w:p>
+      <w:pPr>
+        <w:jc w:val="both"/>
+        <w:ind w:left="340"/>
+        <w:spacing w:after="90" w:line="276" w:lineRule="auto"/>
+      </w:pPr>
+      <w:r>
+        <w:rPr>
+          <w:sz w:val="22"/>
+          <w:szCs w:val="22"/>
+        </w:rPr>
+        <w:t xml:space="preserve">e) definição da estratégia administrativa considerada tecnicamente adequada ao caso;</w:t>
+      </w:r>
+    </w:p>
+    <w:p>
+      <w:pPr>
+        <w:jc w:val="both"/>
+        <w:ind w:left="340"/>
+        <w:spacing w:after="90" w:line="276" w:lineRule="auto"/>
+      </w:pPr>
+      <w:r>
+        <w:rPr>
+          <w:sz w:val="22"/>
+          <w:szCs w:val="22"/>
+        </w:rPr>
+        <w:t xml:space="preserve">f) elaboração das razões do </w:t>
+      </w:r>
+      <w:r>
+        <w:rPr>
+          <w:b/>
+          <w:sz w:val="22"/>
+          <w:szCs w:val="22"/>
+        </w:rPr>
+        <w:t xml:space="preserve">recurso contra o indeferimento</w:t>
+      </w:r>
+      <w:r>
+        <w:rPr>
+          <w:sz w:val="22"/>
+          <w:szCs w:val="22"/>
+        </w:rPr>
+        <w:t xml:space="preserve">;</w:t>
+      </w:r>
+    </w:p>
+    <w:p>
+      <w:pPr>
+        <w:jc w:val="both"/>
+        <w:ind w:left="340"/>
+        <w:spacing w:after="90" w:line="276" w:lineRule="auto"/>
+      </w:pPr>
+      <w:r>
+        <w:rPr>
+          <w:sz w:val="22"/>
+          <w:szCs w:val="22"/>
+        </w:rPr>
+        <w:t xml:space="preserve">g) protocolo do recurso perante o INPI dentro do prazo legal, desde que a CONTRATANTE forneça tempestivamente todos os documentos, procurações, informações e valores necessários;</w:t>
+      </w:r>
+    </w:p>
+    <w:p>
+      <w:pPr>
+        <w:jc w:val="both"/>
+        <w:ind w:left="340"/>
+        <w:spacing w:after="90" w:line="276" w:lineRule="auto"/>
+      </w:pPr>
+      <w:r>
+        <w:rPr>
+          <w:sz w:val="22"/>
+          <w:szCs w:val="22"/>
+        </w:rPr>
+        <w:t xml:space="preserve">h) envio à CONTRATANTE do respectivo comprovante de protocolo;</w:t>
+      </w:r>
+    </w:p>
+    <w:p>
+      <w:pPr>
+        <w:jc w:val="both"/>
+        <w:ind w:left="340"/>
+        <w:spacing w:after="90" w:line="276" w:lineRule="auto"/>
+      </w:pPr>
+      <w:r>
+        <w:rPr>
+          <w:sz w:val="22"/>
+          <w:szCs w:val="22"/>
+        </w:rPr>
+        <w:t xml:space="preserve">i) acompanhamento administrativo do recurso até a publicação da decisão pelo INPI;</w:t>
+      </w:r>
+    </w:p>
+    <w:p>
+      <w:pPr>
+        <w:jc w:val="both"/>
+        <w:ind w:left="340"/>
+        <w:spacing w:after="90" w:line="276" w:lineRule="auto"/>
+      </w:pPr>
+      <w:r>
+        <w:rPr>
+          <w:sz w:val="22"/>
+          <w:szCs w:val="22"/>
+        </w:rPr>
+        <w:t xml:space="preserve">j) comunicação à CONTRATANTE acerca das movimentações relevantes identificadas durante o acompanhamento.</w:t>
+      </w:r>
+    </w:p>
+    <w:p>
+      <w:pPr>
+        <w:jc w:val="both"/>
+        <w:spacing w:after="90" w:line="276" w:lineRule="auto"/>
+      </w:pPr>
+      <w:r>
+        <w:rPr>
+          <w:b/>
+          <w:sz w:val="22"/>
+          <w:szCs w:val="22"/>
+        </w:rPr>
+        <w:t xml:space="preserve">1.3. Finalidade do recurso</w:t>
+      </w:r>
+    </w:p>
+    <w:p>
+      <w:pPr>
+        <w:jc w:val="both"/>
+        <w:spacing w:after="90" w:line="276" w:lineRule="auto"/>
+      </w:pPr>
+      <w:r>
+        <w:rPr>
+          <w:sz w:val="22"/>
+          <w:szCs w:val="22"/>
+        </w:rPr>
+        <w:t xml:space="preserve">O recurso administrativo terá por finalidade requerer ao INPI a </w:t>
+      </w:r>
+      <w:r>
+        <w:rPr>
+          <w:b/>
+          <w:sz w:val="22"/>
+          <w:szCs w:val="22"/>
+        </w:rPr>
+        <w:t xml:space="preserve">reconsideração e reforma da decisão de indeferimento</w:t>
+      </w:r>
+      <w:r>
+        <w:rPr>
+          <w:sz w:val="22"/>
+          <w:szCs w:val="22"/>
+        </w:rPr>
+        <w:t xml:space="preserve">, mediante apresentação dos fundamentos de fato e de direito considerados aplicáveis ao caso.</w:t>
       </w:r>
     </w:p>
     <w:p>
@@ -314,105 +596,245 @@
           <w:sz w:val="22"/>
           <w:szCs w:val="22"/>
         </w:rPr>
-        <w:t xml:space="preserve">O presente contrato não compreende automaticamente:</w:t>
-      </w:r>
-    </w:p>
-    <w:p>
-      <w:pPr>
-        <w:jc w:val="both"/>
-        <w:ind w:left="340"/>
-        <w:spacing w:after="90" w:line="276" w:lineRule="auto"/>
-      </w:pPr>
-      <w:r>
-        <w:rPr>
-          <w:sz w:val="22"/>
-          <w:szCs w:val="22"/>
-        </w:rPr>
-        <w:t xml:space="preserve">a) apresentação de contrarrazões ou manifestações decorrentes de novas ocorrências processuais que exijam elaboração de nova peça técnica;</w:t>
-      </w:r>
-    </w:p>
-    <w:p>
-      <w:pPr>
-        <w:jc w:val="both"/>
-        <w:ind w:left="340"/>
-        <w:spacing w:after="90" w:line="276" w:lineRule="auto"/>
-      </w:pPr>
-      <w:r>
-        <w:rPr>
-          <w:sz w:val="22"/>
-          <w:szCs w:val="22"/>
-        </w:rPr>
-        <w:t xml:space="preserve">b) defesa contra oposições apresentadas por terceiros;</w:t>
-      </w:r>
-    </w:p>
-    <w:p>
-      <w:pPr>
-        <w:jc w:val="both"/>
-        <w:ind w:left="340"/>
-        <w:spacing w:after="90" w:line="276" w:lineRule="auto"/>
-      </w:pPr>
-      <w:r>
-        <w:rPr>
-          <w:sz w:val="22"/>
-          <w:szCs w:val="22"/>
-        </w:rPr>
-        <w:t xml:space="preserve">c) cumprimento de exigências extraordinárias que demandem nova análise ou elaboração técnica não compreendida no objeto inicial;</w:t>
-      </w:r>
-    </w:p>
-    <w:p>
-      <w:pPr>
-        <w:jc w:val="both"/>
-        <w:ind w:left="340"/>
-        <w:spacing w:after="90" w:line="276" w:lineRule="auto"/>
-      </w:pPr>
-      <w:r>
-        <w:rPr>
-          <w:sz w:val="22"/>
-          <w:szCs w:val="22"/>
-        </w:rPr>
-        <w:t xml:space="preserve">d) processos administrativos de nulidade;</w:t>
-      </w:r>
-    </w:p>
-    <w:p>
-      <w:pPr>
-        <w:jc w:val="both"/>
-        <w:ind w:left="340"/>
-        <w:spacing w:after="90" w:line="276" w:lineRule="auto"/>
-      </w:pPr>
-      <w:r>
-        <w:rPr>
-          <w:sz w:val="22"/>
-          <w:szCs w:val="22"/>
-        </w:rPr>
-        <w:t xml:space="preserve">e) elaboração e depósito de novo pedido de registro de marca;</w:t>
-      </w:r>
-    </w:p>
-    <w:p>
-      <w:pPr>
-        <w:jc w:val="both"/>
-        <w:ind w:left="340"/>
-        <w:spacing w:after="90" w:line="276" w:lineRule="auto"/>
-      </w:pPr>
-      <w:r>
-        <w:rPr>
-          <w:sz w:val="22"/>
-          <w:szCs w:val="22"/>
-        </w:rPr>
-        <w:t xml:space="preserve">f) medidas judiciais de qualquer natureza;</w:t>
-      </w:r>
-    </w:p>
-    <w:p>
-      <w:pPr>
-        <w:jc w:val="both"/>
-        <w:ind w:left="340"/>
-        <w:spacing w:after="90" w:line="276" w:lineRule="auto"/>
-      </w:pPr>
-      <w:r>
-        <w:rPr>
-          <w:sz w:val="22"/>
-          <w:szCs w:val="22"/>
-        </w:rPr>
-        <w:t xml:space="preserve">g) atuação em processos distintos do processo nº {{PROCESSO}}.</w:t>
+        <w:t xml:space="preserve">A CONTRATANTE declara estar ciente de que a decisão sobre o recurso compete exclusivamente ao INPI e poderá resultar, entre outras hipóteses, na:</w:t>
+      </w:r>
+    </w:p>
+    <w:p>
+      <w:pPr>
+        <w:jc w:val="both"/>
+        <w:ind w:left="340"/>
+        <w:spacing w:after="90" w:line="276" w:lineRule="auto"/>
+      </w:pPr>
+      <w:r>
+        <w:rPr>
+          <w:sz w:val="22"/>
+          <w:szCs w:val="22"/>
+        </w:rPr>
+        <w:t xml:space="preserve">a) reforma do indeferimento e deferimento do pedido de registro;</w:t>
+      </w:r>
+    </w:p>
+    <w:p>
+      <w:pPr>
+        <w:jc w:val="both"/>
+        <w:ind w:left="340"/>
+        <w:spacing w:after="90" w:line="276" w:lineRule="auto"/>
+      </w:pPr>
+      <w:r>
+        <w:rPr>
+          <w:sz w:val="22"/>
+          <w:szCs w:val="22"/>
+        </w:rPr>
+        <w:t xml:space="preserve">b) reforma do indeferimento com retorno do processo para prosseguimento do exame;</w:t>
+      </w:r>
+    </w:p>
+    <w:p>
+      <w:pPr>
+        <w:jc w:val="both"/>
+        <w:ind w:left="340"/>
+        <w:spacing w:after="90" w:line="276" w:lineRule="auto"/>
+      </w:pPr>
+      <w:r>
+        <w:rPr>
+          <w:sz w:val="22"/>
+          <w:szCs w:val="22"/>
+        </w:rPr>
+        <w:t xml:space="preserve">c) formulação de exigência durante a análise recursal; ou</w:t>
+      </w:r>
+    </w:p>
+    <w:p>
+      <w:pPr>
+        <w:jc w:val="both"/>
+        <w:ind w:left="340"/>
+        <w:spacing w:after="90" w:line="276" w:lineRule="auto"/>
+      </w:pPr>
+      <w:r>
+        <w:rPr>
+          <w:sz w:val="22"/>
+          <w:szCs w:val="22"/>
+        </w:rPr>
+        <w:t xml:space="preserve">d) manutenção do indeferimento.</w:t>
+      </w:r>
+    </w:p>
+    <w:p>
+      <w:pPr>
+        <w:jc w:val="both"/>
+        <w:spacing w:after="90" w:line="276" w:lineRule="auto"/>
+      </w:pPr>
+      <w:r>
+        <w:rPr>
+          <w:b/>
+          <w:sz w:val="22"/>
+          <w:szCs w:val="22"/>
+        </w:rPr>
+        <w:t xml:space="preserve">1.4. Serviços não compreendidos</w:t>
+      </w:r>
+    </w:p>
+    <w:p>
+      <w:pPr>
+        <w:jc w:val="both"/>
+        <w:spacing w:after="70" w:line="276" w:lineRule="auto"/>
+      </w:pPr>
+      <w:r>
+        <w:rPr>
+          <w:sz w:val="22"/>
+          <w:szCs w:val="22"/>
+        </w:rPr>
+        <w:t xml:space="preserve">Salvo contratação expressa em sentido diverso, os honorários previstos neste instrumento </w:t>
+      </w:r>
+      <w:r>
+        <w:rPr>
+          <w:b/>
+          <w:sz w:val="22"/>
+          <w:szCs w:val="22"/>
+        </w:rPr>
+        <w:t xml:space="preserve">não compreendem automaticamente</w:t>
+      </w:r>
+      <w:r>
+        <w:rPr>
+          <w:sz w:val="22"/>
+          <w:szCs w:val="22"/>
+        </w:rPr>
+        <w:t xml:space="preserve">:</w:t>
+      </w:r>
+    </w:p>
+    <w:p>
+      <w:pPr>
+        <w:jc w:val="both"/>
+        <w:ind w:left="340"/>
+        <w:spacing w:after="90" w:line="276" w:lineRule="auto"/>
+      </w:pPr>
+      <w:r>
+        <w:rPr>
+          <w:sz w:val="22"/>
+          <w:szCs w:val="22"/>
+        </w:rPr>
+        <w:t xml:space="preserve">a) cumprimento de exigência técnica ou material formulada pelo INPI em grau de recurso que demande elaboração de nova manifestação;</w:t>
+      </w:r>
+    </w:p>
+    <w:p>
+      <w:pPr>
+        <w:jc w:val="both"/>
+        <w:ind w:left="340"/>
+        <w:spacing w:after="90" w:line="276" w:lineRule="auto"/>
+      </w:pPr>
+      <w:r>
+        <w:rPr>
+          <w:sz w:val="22"/>
+          <w:szCs w:val="22"/>
+        </w:rPr>
+        <w:t xml:space="preserve">b) apresentação de aditamento ao recurso decorrente de fato ou documento superveniente;</w:t>
+      </w:r>
+    </w:p>
+    <w:p>
+      <w:pPr>
+        <w:jc w:val="both"/>
+        <w:ind w:left="340"/>
+        <w:spacing w:after="90" w:line="276" w:lineRule="auto"/>
+      </w:pPr>
+      <w:r>
+        <w:rPr>
+          <w:sz w:val="22"/>
+          <w:szCs w:val="22"/>
+        </w:rPr>
+        <w:t xml:space="preserve">c) manifestações decorrentes de novos impedimentos eventualmente apontados durante o exame;</w:t>
+      </w:r>
+    </w:p>
+    <w:p>
+      <w:pPr>
+        <w:jc w:val="both"/>
+        <w:ind w:left="340"/>
+        <w:spacing w:after="90" w:line="276" w:lineRule="auto"/>
+      </w:pPr>
+      <w:r>
+        <w:rPr>
+          <w:sz w:val="22"/>
+          <w:szCs w:val="22"/>
+        </w:rPr>
+        <w:t xml:space="preserve">d) apresentação de contrarrazões, manifestações ou outras peças não integrantes do recurso originalmente contratado;</w:t>
+      </w:r>
+    </w:p>
+    <w:p>
+      <w:pPr>
+        <w:jc w:val="both"/>
+        <w:ind w:left="340"/>
+        <w:spacing w:after="90" w:line="276" w:lineRule="auto"/>
+      </w:pPr>
+      <w:r>
+        <w:rPr>
+          <w:sz w:val="22"/>
+          <w:szCs w:val="22"/>
+        </w:rPr>
+        <w:t xml:space="preserve">e) pedido administrativo de nulidade;</w:t>
+      </w:r>
+    </w:p>
+    <w:p>
+      <w:pPr>
+        <w:jc w:val="both"/>
+        <w:ind w:left="340"/>
+        <w:spacing w:after="90" w:line="276" w:lineRule="auto"/>
+      </w:pPr>
+      <w:r>
+        <w:rPr>
+          <w:sz w:val="22"/>
+          <w:szCs w:val="22"/>
+        </w:rPr>
+        <w:t xml:space="preserve">f) medidas destinadas à aquisição, cessão, transferência ou negociação de marcas de terceiros apontadas como anterioridades;</w:t>
+      </w:r>
+    </w:p>
+    <w:p>
+      <w:pPr>
+        <w:jc w:val="both"/>
+        <w:ind w:left="340"/>
+        <w:spacing w:after="90" w:line="276" w:lineRule="auto"/>
+      </w:pPr>
+      <w:r>
+        <w:rPr>
+          <w:sz w:val="22"/>
+          <w:szCs w:val="22"/>
+        </w:rPr>
+        <w:t xml:space="preserve">g) elaboração de acordo ou instrumento de coexistência entre marcas;</w:t>
+      </w:r>
+    </w:p>
+    <w:p>
+      <w:pPr>
+        <w:jc w:val="both"/>
+        <w:ind w:left="340"/>
+        <w:spacing w:after="90" w:line="276" w:lineRule="auto"/>
+      </w:pPr>
+      <w:r>
+        <w:rPr>
+          <w:sz w:val="22"/>
+          <w:szCs w:val="22"/>
+        </w:rPr>
+        <w:t xml:space="preserve">h) notificações extrajudiciais;</w:t>
+      </w:r>
+    </w:p>
+    <w:p>
+      <w:pPr>
+        <w:jc w:val="both"/>
+        <w:ind w:left="340"/>
+        <w:spacing w:after="90" w:line="276" w:lineRule="auto"/>
+      </w:pPr>
+      <w:r>
+        <w:rPr>
+          <w:sz w:val="22"/>
+          <w:szCs w:val="22"/>
+        </w:rPr>
+        <w:t xml:space="preserve">i) medidas judiciais de qualquer natureza;</w:t>
+      </w:r>
+    </w:p>
+    <w:p>
+      <w:pPr>
+        <w:jc w:val="both"/>
+        <w:ind w:left="340"/>
+        <w:spacing w:after="90" w:line="276" w:lineRule="auto"/>
+      </w:pPr>
+      <w:r>
+        <w:rPr>
+          <w:sz w:val="22"/>
+          <w:szCs w:val="22"/>
+        </w:rPr>
+        <w:t xml:space="preserve">j) atuação em processos distintos do processo indicado na Cláusula 1.1.</w:t>
       </w:r>
     </w:p>
     <w:p>
@@ -425,28 +847,22 @@
           <w:sz w:val="22"/>
           <w:szCs w:val="22"/>
         </w:rPr>
-        <w:t xml:space="preserve">Caso qualquer dessas providências seja necessária, sua execução dependerá de nova contratação e definição dos respectivos honorários, mediante prévio alinhamento entre as Partes.</w:t>
-      </w:r>
-    </w:p>
-    <w:p>
-      <w:pPr>
-        <w:jc w:val="both"/>
-        <w:spacing w:after="140" w:line="276" w:lineRule="auto"/>
-      </w:pPr>
-      <w:r>
-        <w:rPr>
-          <w:b/>
-          <w:sz w:val="22"/>
-          <w:szCs w:val="22"/>
-        </w:rPr>
-        <w:t xml:space="preserve">1.4.</w:t>
-      </w:r>
-      <w:r>
-        <w:rPr>
-          <w:sz w:val="22"/>
-          <w:szCs w:val="22"/>
-        </w:rPr>
-        <w:t xml:space="preserve"> O objeto deste contrato será executado predominantemente à distância, por meio eletrônico, incluindo comunicações, análise documental e protocolo perante os sistemas oficiais do INPI.</w:t>
+        <w:t xml:space="preserve">Caso qualquer dessas providências seja necessária, sua realização dependerá de </w:t>
+      </w:r>
+      <w:r>
+        <w:rPr>
+          <w:b/>
+          <w:sz w:val="22"/>
+          <w:szCs w:val="22"/>
+        </w:rPr>
+        <w:t xml:space="preserve">prévio alinhamento e nova contratação</w:t>
+      </w:r>
+      <w:r>
+        <w:rPr>
+          <w:sz w:val="22"/>
+          <w:szCs w:val="22"/>
+        </w:rPr>
+        <w:t xml:space="preserve">, com definição dos respectivos honorários.</w:t>
       </w:r>
     </w:p>
     <w:p>
@@ -467,7 +883,7 @@
           <w:sz w:val="22"/>
           <w:szCs w:val="22"/>
         </w:rPr>
-        <w:t xml:space="preserve"> Os direitos e obrigações decorrentes deste contrato são celebrados especificamente entre as Partes, observados os limites da legislação aplicável.</w:t>
+        <w:t xml:space="preserve"> O objeto deste contrato será executado predominantemente à distância, por meio eletrônico, incluindo comunicações, pesquisa, análise documental e peticionamento perante os sistemas oficiais do INPI.</w:t>
       </w:r>
     </w:p>
     <w:p>
@@ -522,91 +938,105 @@
           <w:sz w:val="22"/>
           <w:szCs w:val="22"/>
         </w:rPr>
-        <w:t xml:space="preserve">a) executar os serviços contratados com diligência, zelo técnico e observância das normas aplicáveis;</w:t>
-      </w:r>
-    </w:p>
-    <w:p>
-      <w:pPr>
-        <w:jc w:val="both"/>
-        <w:ind w:left="340"/>
-        <w:spacing w:after="90" w:line="276" w:lineRule="auto"/>
-      </w:pPr>
-      <w:r>
-        <w:rPr>
-          <w:sz w:val="22"/>
-          <w:szCs w:val="22"/>
-        </w:rPr>
-        <w:t xml:space="preserve">b) analisar a decisão de indeferimento e elaborar as razões de recurso que entender juridicamente adequadas à defesa dos interesses da CONTRATANTE;</w:t>
-      </w:r>
-    </w:p>
-    <w:p>
-      <w:pPr>
-        <w:jc w:val="both"/>
-        <w:ind w:left="340"/>
-        <w:spacing w:after="90" w:line="276" w:lineRule="auto"/>
-      </w:pPr>
-      <w:r>
-        <w:rPr>
-          <w:sz w:val="22"/>
-          <w:szCs w:val="22"/>
-        </w:rPr>
-        <w:t xml:space="preserve">c) protocolar o recurso perante o INPI, desde que tenham sido disponibilizados, em tempo hábil, todos os documentos, informações, procurações, autorizações e valores eventualmente necessários;</w:t>
-      </w:r>
-    </w:p>
-    <w:p>
-      <w:pPr>
-        <w:jc w:val="both"/>
-        <w:ind w:left="340"/>
-        <w:spacing w:after="90" w:line="276" w:lineRule="auto"/>
-      </w:pPr>
-      <w:r>
-        <w:rPr>
-          <w:sz w:val="22"/>
-          <w:szCs w:val="22"/>
-        </w:rPr>
-        <w:t xml:space="preserve">d) acompanhar o andamento administrativo do processo nos limites estabelecidos neste contrato;</w:t>
-      </w:r>
-    </w:p>
-    <w:p>
-      <w:pPr>
-        <w:jc w:val="both"/>
-        <w:ind w:left="340"/>
-        <w:spacing w:after="90" w:line="276" w:lineRule="auto"/>
-      </w:pPr>
-      <w:r>
-        <w:rPr>
-          <w:sz w:val="22"/>
-          <w:szCs w:val="22"/>
-        </w:rPr>
-        <w:t xml:space="preserve">e) informar à CONTRATANTE sobre movimentações processuais relevantes;</w:t>
-      </w:r>
-    </w:p>
-    <w:p>
-      <w:pPr>
-        <w:jc w:val="both"/>
-        <w:ind w:left="340"/>
-        <w:spacing w:after="90" w:line="276" w:lineRule="auto"/>
-      </w:pPr>
-      <w:r>
-        <w:rPr>
-          <w:sz w:val="22"/>
-          <w:szCs w:val="22"/>
-        </w:rPr>
-        <w:t xml:space="preserve">f) manter o sigilo das informações e documentos recebidos em decorrência desta contratação;</w:t>
-      </w:r>
-    </w:p>
-    <w:p>
-      <w:pPr>
-        <w:jc w:val="both"/>
-        <w:ind w:left="340"/>
-        <w:spacing w:after="90" w:line="276" w:lineRule="auto"/>
-      </w:pPr>
-      <w:r>
-        <w:rPr>
-          <w:sz w:val="22"/>
-          <w:szCs w:val="22"/>
-        </w:rPr>
-        <w:t xml:space="preserve">g) fornecer à CONTRATANTE, após o protocolo, comprovante ou informação que permita verificar a apresentação do recurso perante o INPI.</w:t>
+        <w:t xml:space="preserve">a) executar os serviços contratados com diligência, zelo técnico e observância da legislação e das normas administrativas aplicáveis;</w:t>
+      </w:r>
+    </w:p>
+    <w:p>
+      <w:pPr>
+        <w:jc w:val="both"/>
+        <w:ind w:left="340"/>
+        <w:spacing w:after="90" w:line="276" w:lineRule="auto"/>
+      </w:pPr>
+      <w:r>
+        <w:rPr>
+          <w:sz w:val="22"/>
+          <w:szCs w:val="22"/>
+        </w:rPr>
+        <w:t xml:space="preserve">b) analisar a fundamentação utilizada pelo INPI para o indeferimento;</w:t>
+      </w:r>
+    </w:p>
+    <w:p>
+      <w:pPr>
+        <w:jc w:val="both"/>
+        <w:ind w:left="340"/>
+        <w:spacing w:after="90" w:line="276" w:lineRule="auto"/>
+      </w:pPr>
+      <w:r>
+        <w:rPr>
+          <w:sz w:val="22"/>
+          <w:szCs w:val="22"/>
+        </w:rPr>
+        <w:t xml:space="preserve">c) elaborar o recurso com os argumentos técnicos e jurídicos considerados adequados à defesa dos interesses da CONTRATANTE;</w:t>
+      </w:r>
+    </w:p>
+    <w:p>
+      <w:pPr>
+        <w:jc w:val="both"/>
+        <w:ind w:left="340"/>
+        <w:spacing w:after="90" w:line="276" w:lineRule="auto"/>
+      </w:pPr>
+      <w:r>
+        <w:rPr>
+          <w:sz w:val="22"/>
+          <w:szCs w:val="22"/>
+        </w:rPr>
+        <w:t xml:space="preserve">d) protocolar o recurso perante o INPI, desde que tenham sido disponibilizados tempestivamente todos os documentos, informações, procurações e valores necessários;</w:t>
+      </w:r>
+    </w:p>
+    <w:p>
+      <w:pPr>
+        <w:jc w:val="both"/>
+        <w:ind w:left="340"/>
+        <w:spacing w:after="90" w:line="276" w:lineRule="auto"/>
+      </w:pPr>
+      <w:r>
+        <w:rPr>
+          <w:sz w:val="22"/>
+          <w:szCs w:val="22"/>
+        </w:rPr>
+        <w:t xml:space="preserve">e) acompanhar o andamento administrativo do recurso nos limites deste contrato;</w:t>
+      </w:r>
+    </w:p>
+    <w:p>
+      <w:pPr>
+        <w:jc w:val="both"/>
+        <w:ind w:left="340"/>
+        <w:spacing w:after="90" w:line="276" w:lineRule="auto"/>
+      </w:pPr>
+      <w:r>
+        <w:rPr>
+          <w:sz w:val="22"/>
+          <w:szCs w:val="22"/>
+        </w:rPr>
+        <w:t xml:space="preserve">f) comunicar à CONTRATANTE as movimentações relevantes do processo;</w:t>
+      </w:r>
+    </w:p>
+    <w:p>
+      <w:pPr>
+        <w:jc w:val="both"/>
+        <w:ind w:left="340"/>
+        <w:spacing w:after="90" w:line="276" w:lineRule="auto"/>
+      </w:pPr>
+      <w:r>
+        <w:rPr>
+          <w:sz w:val="22"/>
+          <w:szCs w:val="22"/>
+        </w:rPr>
+        <w:t xml:space="preserve">g) manter sigilo sobre as informações e documentos recebidos em decorrência desta contratação;</w:t>
+      </w:r>
+    </w:p>
+    <w:p>
+      <w:pPr>
+        <w:jc w:val="both"/>
+        <w:ind w:left="340"/>
+        <w:spacing w:after="90" w:line="276" w:lineRule="auto"/>
+      </w:pPr>
+      <w:r>
+        <w:rPr>
+          <w:sz w:val="22"/>
+          <w:szCs w:val="22"/>
+        </w:rPr>
+        <w:t xml:space="preserve">h) fornecer à CONTRATANTE o comprovante de protocolo do recurso e demais informações necessárias para acompanhamento do processo.</w:t>
       </w:r>
     </w:p>
     <w:p>
@@ -661,63 +1091,78 @@
           <w:sz w:val="22"/>
           <w:szCs w:val="22"/>
         </w:rPr>
-        <w:t xml:space="preserve">b) fornecer documentos, provas, informações e esclarecimentos solicitados pela CONTRATADA no prazo máximo de 48 (quarenta e oito) horas após a solicitação, ou em prazo inferior quando a proximidade do prazo processual assim exigir;</w:t>
-      </w:r>
-    </w:p>
-    <w:p>
-      <w:pPr>
-        <w:jc w:val="both"/>
-        <w:ind w:left="340"/>
-        <w:spacing w:after="90" w:line="276" w:lineRule="auto"/>
-      </w:pPr>
-      <w:r>
-        <w:rPr>
-          <w:sz w:val="22"/>
-          <w:szCs w:val="22"/>
-        </w:rPr>
-        <w:t xml:space="preserve">c) garantir que as informações e documentos fornecidos são verdadeiros, completos e legítimos;</w:t>
-      </w:r>
-    </w:p>
-    <w:p>
-      <w:pPr>
-        <w:jc w:val="both"/>
-        <w:ind w:left="340"/>
-        <w:spacing w:after="90" w:line="276" w:lineRule="auto"/>
-      </w:pPr>
-      <w:r>
-        <w:rPr>
-          <w:sz w:val="22"/>
-          <w:szCs w:val="22"/>
-        </w:rPr>
-        <w:t xml:space="preserve">d) comunicar imediatamente qualquer informação, fato ou documento que possa interferir na análise ou na defesa do processo;</w:t>
-      </w:r>
-    </w:p>
-    <w:p>
-      <w:pPr>
-        <w:jc w:val="both"/>
-        <w:ind w:left="340"/>
-        <w:spacing w:after="90" w:line="276" w:lineRule="auto"/>
-      </w:pPr>
-      <w:r>
-        <w:rPr>
-          <w:sz w:val="22"/>
-          <w:szCs w:val="22"/>
-        </w:rPr>
-        <w:t xml:space="preserve">e) efetuar, dentro dos respectivos prazos, o pagamento de eventuais taxas oficiais ou despesas necessárias à prática dos atos perante o INPI;</w:t>
-      </w:r>
-    </w:p>
-    <w:p>
-      <w:pPr>
-        <w:jc w:val="both"/>
-        <w:ind w:left="340"/>
-        <w:spacing w:after="90" w:line="276" w:lineRule="auto"/>
-      </w:pPr>
-      <w:r>
-        <w:rPr>
-          <w:sz w:val="22"/>
-          <w:szCs w:val="22"/>
-        </w:rPr>
-        <w:t xml:space="preserve">f) fornecer procuração e demais documentos necessários à representação perante o INPI, quando solicitados.</w:t>
+        <w:t xml:space="preserve">b) fornecer os documentos, informações, provas e esclarecimentos solicitados pela CONTRATADA no prazo máximo de </w:t>
+      </w:r>
+      <w:r>
+        <w:rPr>
+          <w:b/>
+          <w:sz w:val="22"/>
+          <w:szCs w:val="22"/>
+        </w:rPr>
+        <w:t xml:space="preserve">48 (quarenta e oito) horas</w:t>
+      </w:r>
+      <w:r>
+        <w:rPr>
+          <w:sz w:val="22"/>
+          <w:szCs w:val="22"/>
+        </w:rPr>
+        <w:t xml:space="preserve">, ou em prazo inferior quando a proximidade do prazo administrativo assim exigir;</w:t>
+      </w:r>
+    </w:p>
+    <w:p>
+      <w:pPr>
+        <w:jc w:val="both"/>
+        <w:ind w:left="340"/>
+        <w:spacing w:after="90" w:line="276" w:lineRule="auto"/>
+      </w:pPr>
+      <w:r>
+        <w:rPr>
+          <w:sz w:val="22"/>
+          <w:szCs w:val="22"/>
+        </w:rPr>
+        <w:t xml:space="preserve">c) declarar e garantir a veracidade, integridade e legitimidade das informações e documentos disponibilizados;</w:t>
+      </w:r>
+    </w:p>
+    <w:p>
+      <w:pPr>
+        <w:jc w:val="both"/>
+        <w:ind w:left="340"/>
+        <w:spacing w:after="90" w:line="276" w:lineRule="auto"/>
+      </w:pPr>
+      <w:r>
+        <w:rPr>
+          <w:sz w:val="22"/>
+          <w:szCs w:val="22"/>
+        </w:rPr>
+        <w:t xml:space="preserve">d) comunicar imediatamente qualquer circunstância que possa influenciar na análise ou no julgamento do recurso;</w:t>
+      </w:r>
+    </w:p>
+    <w:p>
+      <w:pPr>
+        <w:jc w:val="both"/>
+        <w:ind w:left="340"/>
+        <w:spacing w:after="90" w:line="276" w:lineRule="auto"/>
+      </w:pPr>
+      <w:r>
+        <w:rPr>
+          <w:sz w:val="22"/>
+          <w:szCs w:val="22"/>
+        </w:rPr>
+        <w:t xml:space="preserve">e) fornecer procuração e demais documentos necessários à representação perante o INPI;</w:t>
+      </w:r>
+    </w:p>
+    <w:p>
+      <w:pPr>
+        <w:jc w:val="both"/>
+        <w:ind w:left="340"/>
+        <w:spacing w:after="90" w:line="276" w:lineRule="auto"/>
+      </w:pPr>
+      <w:r>
+        <w:rPr>
+          <w:sz w:val="22"/>
+          <w:szCs w:val="22"/>
+        </w:rPr>
+        <w:t xml:space="preserve">f) efetuar tempestivamente o pagamento das taxas e retribuições oficiais necessárias à apresentação do recurso e à prática de outros atos que eventualmente sejam autorizados.</w:t>
       </w:r>
     </w:p>
     <w:p>
@@ -738,7 +1183,7 @@
           <w:sz w:val="22"/>
           <w:szCs w:val="22"/>
         </w:rPr>
-        <w:t xml:space="preserve"> A CONTRATADA não poderá ser responsabilizada por perda de prazo, prejuízo processual ou impossibilidade de apresentação completa do recurso quando decorrentes do atraso, omissão ou fornecimento incompleto de documentos, informações, autorizações ou pagamentos de responsabilidade da CONTRATANTE.</w:t>
+        <w:t xml:space="preserve"> Considerando a existência de prazo legal para interposição do recurso, a CONTRATADA não será responsabilizada pela impossibilidade de protocolo ou por prejuízos processuais decorrentes de atraso, omissão ou fornecimento incompleto de documentos, informações, procurações, autorizações ou pagamentos cuja responsabilidade seja da CONTRATANTE.</w:t>
       </w:r>
     </w:p>
     <w:p>
@@ -773,7 +1218,22 @@
           <w:sz w:val="22"/>
           <w:szCs w:val="22"/>
         </w:rPr>
-        <w:t xml:space="preserve"> Pela prestação dos serviços profissionais objeto deste contrato, a CONTRATANTE pagará à CONTRATADA o valor total de R$ {{VALOR}} ({{VALOR_EXTENSO}}), {{CONDICAO_PGTO}}</w:t>
+        <w:t xml:space="preserve"> Pela prestação dos serviços profissionais previstos neste contrato, a CONTRATANTE pagará à CONTRATADA o valor total de </w:t>
+      </w:r>
+      <w:r>
+        <w:rPr>
+          <w:b/>
+          <w:sz w:val="22"/>
+          <w:szCs w:val="22"/>
+        </w:rPr>
+        <w:t xml:space="preserve">R$ {{VALOR}} ({{VALOR_EXTENSO}})</w:t>
+      </w:r>
+      <w:r>
+        <w:rPr>
+          <w:sz w:val="22"/>
+          <w:szCs w:val="22"/>
+        </w:rPr>
+        <w:t xml:space="preserve">, {{CONDICAO_PGTO}}</w:t>
       </w:r>
     </w:p>
     <w:p>
@@ -786,7 +1246,7 @@
           <w:sz w:val="22"/>
           <w:szCs w:val="22"/>
         </w:rPr>
-        <w:t xml:space="preserve">O pagamento da entrada poderá ser realizado mediante PIX para a chave 56.029.137/0001-23, ou por outro meio disponibilizado pela CONTRATADA.</w:t>
+        <w:t xml:space="preserve">O pagamento poderá ser realizado mediante PIX para a chave 56.029.137/0001-23, ou por outro meio disponibilizado pela CONTRATADA.</w:t>
       </w:r>
     </w:p>
     <w:p>
@@ -835,21 +1295,51 @@
           <w:sz w:val="22"/>
           <w:szCs w:val="22"/>
         </w:rPr>
-        <w:t xml:space="preserve">b) multa moratória de 2% (dois por cento) sobre o valor em atraso; e</w:t>
-      </w:r>
-    </w:p>
-    <w:p>
-      <w:pPr>
-        <w:jc w:val="both"/>
-        <w:ind w:left="340"/>
-        <w:spacing w:after="90" w:line="276" w:lineRule="auto"/>
-      </w:pPr>
-      <w:r>
-        <w:rPr>
-          <w:sz w:val="22"/>
-          <w:szCs w:val="22"/>
-        </w:rPr>
-        <w:t xml:space="preserve">c) juros de mora de 1% (um por cento) ao mês, calculados proporcionalmente ao período de atraso.</w:t>
+        <w:t xml:space="preserve">b) multa moratória de </w:t>
+      </w:r>
+      <w:r>
+        <w:rPr>
+          <w:b/>
+          <w:sz w:val="22"/>
+          <w:szCs w:val="22"/>
+        </w:rPr>
+        <w:t xml:space="preserve">2% (dois por cento)</w:t>
+      </w:r>
+      <w:r>
+        <w:rPr>
+          <w:sz w:val="22"/>
+          <w:szCs w:val="22"/>
+        </w:rPr>
+        <w:t xml:space="preserve"> sobre o valor em atraso; e</w:t>
+      </w:r>
+    </w:p>
+    <w:p>
+      <w:pPr>
+        <w:jc w:val="both"/>
+        <w:ind w:left="340"/>
+        <w:spacing w:after="90" w:line="276" w:lineRule="auto"/>
+      </w:pPr>
+      <w:r>
+        <w:rPr>
+          <w:sz w:val="22"/>
+          <w:szCs w:val="22"/>
+        </w:rPr>
+        <w:t xml:space="preserve">c) juros de mora de </w:t>
+      </w:r>
+      <w:r>
+        <w:rPr>
+          <w:b/>
+          <w:sz w:val="22"/>
+          <w:szCs w:val="22"/>
+        </w:rPr>
+        <w:t xml:space="preserve">1% (um por cento) ao mês</w:t>
+      </w:r>
+      <w:r>
+        <w:rPr>
+          <w:sz w:val="22"/>
+          <w:szCs w:val="22"/>
+        </w:rPr>
+        <w:t xml:space="preserve">, calculados proporcionalmente ao período de atraso.</w:t>
       </w:r>
     </w:p>
     <w:p>
@@ -870,7 +1360,22 @@
           <w:sz w:val="22"/>
           <w:szCs w:val="22"/>
         </w:rPr>
-        <w:t xml:space="preserve"> Os honorários previstos neste contrato não incluem taxas oficiais, emolumentos ou despesas cobradas pelo INPI ou por terceiros, quando necessárias à execução do serviço, as quais serão de responsabilidade da CONTRATANTE.</w:t>
+        <w:t xml:space="preserve"> Os honorários profissionais previstos neste contrato </w:t>
+      </w:r>
+      <w:r>
+        <w:rPr>
+          <w:b/>
+          <w:sz w:val="22"/>
+          <w:szCs w:val="22"/>
+        </w:rPr>
+        <w:t xml:space="preserve">não compreendem as retribuições oficiais cobradas pelo INPI</w:t>
+      </w:r>
+      <w:r>
+        <w:rPr>
+          <w:sz w:val="22"/>
+          <w:szCs w:val="22"/>
+        </w:rPr>
+        <w:t xml:space="preserve">, despesas administrativas ou outras despesas necessárias à prática dos atos contratados, as quais serão suportadas pela CONTRATANTE.</w:t>
       </w:r>
     </w:p>
     <w:p>
@@ -891,7 +1396,28 @@
           <w:sz w:val="22"/>
           <w:szCs w:val="22"/>
         </w:rPr>
-        <w:t xml:space="preserve"> Havendo necessidade de recolhimento de taxa oficial perante o INPI, inclusive a retribuição devida pela interposição do recurso, a CONTRATADA informará à CONTRATANTE os dados e orientações necessários para sua quitação.</w:t>
+        <w:t xml:space="preserve"> A CONTRATADA informará previamente à CONTRATANTE sobre eventual taxa ou retribuição oficial necessária à apresentação do recurso ou à prática de ato adicional previamente autorizado.</w:t>
+      </w:r>
+    </w:p>
+    <w:p>
+      <w:pPr>
+        <w:jc w:val="both"/>
+        <w:spacing w:after="90" w:line="276" w:lineRule="auto"/>
+      </w:pPr>
+      <w:r>
+        <w:rPr>
+          <w:b/>
+          <w:sz w:val="22"/>
+          <w:szCs w:val="22"/>
+        </w:rPr>
+        <w:t xml:space="preserve">3.5.</w:t>
+      </w:r>
+      <w:r>
+        <w:rPr>
+          <w:sz w:val="22"/>
+          <w:szCs w:val="22"/>
+        </w:rPr>
+        <w:t xml:space="preserve"> A CONTRATANTE declara estar ciente de que o pagamento tempestivo da retribuição oficial correspondente constitui condição necessária à adequada apresentação do recurso, quando exigida pelo INPI.</w:t>
       </w:r>
     </w:p>
     <w:p>
@@ -901,24 +1427,16 @@
       </w:pPr>
       <w:r>
         <w:rPr>
-          <w:b/>
-          <w:sz w:val="22"/>
-          <w:szCs w:val="22"/>
-        </w:rPr>
-        <w:t xml:space="preserve">3.5.</w:t>
-      </w:r>
-      <w:r>
-        <w:rPr>
-          <w:sz w:val="22"/>
-          <w:szCs w:val="22"/>
-        </w:rPr>
-        <w:t xml:space="preserve"> A CONTRATANTE declara estar ciente de que o não pagamento de eventual taxa oficial dentro do prazo estabelecido pelo INPI poderá impedir o conhecimento do recurso ou a prática do ato correspondente, não sendo a CONTRATADA responsável por prejuízos decorrentes da ausência ou atraso do pagamento imputável à CONTRATANTE.</w:t>
-      </w:r>
-    </w:p>
-    <w:p>
-      <w:pPr>
-        <w:jc w:val="both"/>
-        <w:spacing w:after="110" w:line="276" w:lineRule="auto"/>
+          <w:sz w:val="22"/>
+          <w:szCs w:val="22"/>
+        </w:rPr>
+        <w:t xml:space="preserve">A ausência ou atraso no pagamento poderá impossibilitar a prática do ato ou produzir consequências administrativas, não sendo a CONTRATADA responsável por prejuízo decorrente de inadimplemento imputável à CONTRATANTE.</w:t>
+      </w:r>
+    </w:p>
+    <w:p>
+      <w:pPr>
+        <w:jc w:val="both"/>
+        <w:spacing w:after="280" w:line="276" w:lineRule="auto"/>
       </w:pPr>
       <w:r>
         <w:rPr>
@@ -933,20 +1451,37 @@
           <w:sz w:val="22"/>
           <w:szCs w:val="22"/>
         </w:rPr>
-        <w:t xml:space="preserve"> Os honorários previstos na Cláusula 3.1 remuneram especificamente os serviços descritos na Cláusula 1ª deste contrato, relacionados ao recurso contra o indeferimento proferido no processo nº {{PROCESSO}}.</w:t>
-      </w:r>
-    </w:p>
-    <w:p>
-      <w:pPr>
-        <w:jc w:val="both"/>
-        <w:spacing w:after="280" w:line="276" w:lineRule="auto"/>
-      </w:pPr>
-      <w:r>
-        <w:rPr>
-          <w:sz w:val="22"/>
-          <w:szCs w:val="22"/>
-        </w:rPr>
-        <w:t xml:space="preserve">A necessidade de eventual ação judicial, processo administrativo de nulidade, defesa de oposição, novo pedido de registro, manifestação extraordinária ou outro procedimento não expressamente incluído neste instrumento será objeto de novo orçamento e contratação específica.</w:t>
+        <w:t xml:space="preserve"> Os honorários previstos na Cláusula 3.1 remuneram especificamente a </w:t>
+      </w:r>
+      <w:r>
+        <w:rPr>
+          <w:b/>
+          <w:sz w:val="22"/>
+          <w:szCs w:val="22"/>
+        </w:rPr>
+        <w:t xml:space="preserve">análise da decisão de indeferimento, elaboração, protocolo e acompanhamento do recurso administrativo</w:t>
+      </w:r>
+      <w:r>
+        <w:rPr>
+          <w:sz w:val="22"/>
+          <w:szCs w:val="22"/>
+        </w:rPr>
+        <w:t xml:space="preserve"> referente ao processo nº </w:t>
+      </w:r>
+      <w:r>
+        <w:rPr>
+          <w:b/>
+          <w:sz w:val="22"/>
+          <w:szCs w:val="22"/>
+        </w:rPr>
+        <w:t xml:space="preserve">{{PROCESSO}}</w:t>
+      </w:r>
+      <w:r>
+        <w:rPr>
+          <w:sz w:val="22"/>
+          <w:szCs w:val="22"/>
+        </w:rPr>
+        <w:t xml:space="preserve">, observados os limites estabelecidos neste instrumento.</w:t>
       </w:r>
     </w:p>
     <w:p>
@@ -981,7 +1516,43 @@
           <w:sz w:val="22"/>
           <w:szCs w:val="22"/>
         </w:rPr>
-        <w:t xml:space="preserve"> O presente contrato entra em vigor na data de sua assinatura e permanecerá válido durante a execução dos serviços previstos na Cláusula 1ª, incluindo o acompanhamento administrativo do processo até a decisão do INPI acerca do recurso, ressalvados os atos expressamente excluídos deste contrato.</w:t>
+        <w:t xml:space="preserve"> O presente contrato entra em vigor na data de sua assinatura e permanecerá válido durante a execução dos serviços contratados, encerrando-se com a </w:t>
+      </w:r>
+      <w:r>
+        <w:rPr>
+          <w:b/>
+          <w:sz w:val="22"/>
+          <w:szCs w:val="22"/>
+        </w:rPr>
+        <w:t xml:space="preserve">publicação da decisão administrativa referente ao recurso</w:t>
+      </w:r>
+      <w:r>
+        <w:rPr>
+          <w:sz w:val="22"/>
+          <w:szCs w:val="22"/>
+        </w:rPr>
+        <w:t xml:space="preserve">, ressalvados os serviços expressamente excluídos deste instrumento.</w:t>
+      </w:r>
+    </w:p>
+    <w:p>
+      <w:pPr>
+        <w:jc w:val="both"/>
+        <w:spacing w:after="140" w:line="276" w:lineRule="auto"/>
+      </w:pPr>
+      <w:r>
+        <w:rPr>
+          <w:b/>
+          <w:sz w:val="22"/>
+          <w:szCs w:val="22"/>
+        </w:rPr>
+        <w:t xml:space="preserve">4.2.</w:t>
+      </w:r>
+      <w:r>
+        <w:rPr>
+          <w:sz w:val="22"/>
+          <w:szCs w:val="22"/>
+        </w:rPr>
+        <w:t xml:space="preserve"> A CONTRATANTE reconhece que o prazo de tramitação e julgamento do recurso depende exclusivamente do INPI, não podendo a CONTRATADA assegurar ou estipular data para sua decisão.</w:t>
       </w:r>
     </w:p>
     <w:p>
@@ -995,14 +1566,14 @@
           <w:sz w:val="22"/>
           <w:szCs w:val="22"/>
         </w:rPr>
-        <w:t xml:space="preserve">4.2.</w:t>
-      </w:r>
-      <w:r>
-        <w:rPr>
-          <w:sz w:val="22"/>
-          <w:szCs w:val="22"/>
-        </w:rPr>
-        <w:t xml:space="preserve"> O recurso está sujeito a prazo legal preclusivo, contado da publicação da decisão de indeferimento na Revista da Propriedade Industrial – RPI, razão pela qual documentos e informações solicitados deverão ser disponibilizados dentro dos prazos indicados pela CONTRATADA.</w:t>
+        <w:t xml:space="preserve">4.3.</w:t>
+      </w:r>
+      <w:r>
+        <w:rPr>
+          <w:sz w:val="22"/>
+          <w:szCs w:val="22"/>
+        </w:rPr>
+        <w:t xml:space="preserve"> O encerramento deste contrato com a decisão do recurso não implica contratação automática de eventual medida administrativa ou judicial posterior.</w:t>
       </w:r>
     </w:p>
     <w:p>
@@ -1058,7 +1629,7 @@
           <w:sz w:val="22"/>
           <w:szCs w:val="22"/>
         </w:rPr>
-        <w:t xml:space="preserve"> Caso a rescisão ocorra por iniciativa da CONTRATANTE após o início da análise técnica, elaboração das razões de recurso ou execução dos serviços contratados, permanecerão devidos os honorários correspondentes aos serviços já realizados, sem prejuízo das demais disposições aplicáveis.</w:t>
+        <w:t xml:space="preserve"> Caso a rescisão ocorra por iniciativa da CONTRATANTE após o início da análise técnica ou elaboração do recurso, permanecerão devidos os honorários correspondentes aos serviços já realizados.</w:t>
       </w:r>
     </w:p>
     <w:p>
@@ -1079,7 +1650,7 @@
           <w:sz w:val="22"/>
           <w:szCs w:val="22"/>
         </w:rPr>
-        <w:t xml:space="preserve"> Havendo revogação do mandato pela CONTRATANTE após a elaboração ou protocolo do recurso, sem culpa da CONTRATADA, serão devidos integralmente os honorários contratados.</w:t>
+        <w:t xml:space="preserve"> Havendo revogação do mandato após a conclusão ou protocolo do recurso, sem culpa da CONTRATADA, serão devidos integralmente os honorários contratados.</w:t>
       </w:r>
     </w:p>
     <w:p>
@@ -1100,7 +1671,7 @@
           <w:sz w:val="22"/>
           <w:szCs w:val="22"/>
         </w:rPr>
-        <w:t xml:space="preserve"> O contrato poderá ser rescindido imediatamente pela Parte prejudicada em caso de descumprimento relevante de quaisquer de suas obrigações, mediante comunicação escrita, sem prejuízo da apuração de eventuais valores ou indenizações cabíveis.</w:t>
+        <w:t xml:space="preserve"> O contrato poderá ser rescindido imediatamente pela Parte prejudicada em caso de descumprimento relevante de suas disposições, mediante comunicação escrita, sem prejuízo das obrigações e valores já constituídos.</w:t>
       </w:r>
     </w:p>
     <w:p>
@@ -1141,20 +1712,50 @@
           <w:sz w:val="22"/>
           <w:szCs w:val="22"/>
         </w:rPr>
-        <w:t xml:space="preserve">A CONTRATANTE declara estar ciente de que a contratação da CONTRATADA representa uma obrigação de meio e não de resultado.</w:t>
-      </w:r>
-    </w:p>
-    <w:p>
-      <w:pPr>
-        <w:jc w:val="both"/>
-        <w:spacing w:after="90" w:line="276" w:lineRule="auto"/>
-      </w:pPr>
-      <w:r>
-        <w:rPr>
-          <w:sz w:val="22"/>
-          <w:szCs w:val="22"/>
-        </w:rPr>
-        <w:t xml:space="preserve">A apresentação do recurso não garante a reforma da decisão de indeferimento nem a concessão do registro da marca, uma vez que a análise e a decisão final competem exclusivamente ao INPI.</w:t>
+        <w:t xml:space="preserve">A CONTRATANTE declara estar ciente de que a prestação dos serviços profissionais objeto deste contrato constitui </w:t>
+      </w:r>
+      <w:r>
+        <w:rPr>
+          <w:b/>
+          <w:sz w:val="22"/>
+          <w:szCs w:val="22"/>
+        </w:rPr>
+        <w:t xml:space="preserve">obrigação de meio e não de resultado</w:t>
+      </w:r>
+      <w:r>
+        <w:rPr>
+          <w:sz w:val="22"/>
+          <w:szCs w:val="22"/>
+        </w:rPr>
+        <w:t xml:space="preserve">.</w:t>
+      </w:r>
+    </w:p>
+    <w:p>
+      <w:pPr>
+        <w:jc w:val="both"/>
+        <w:spacing w:after="90" w:line="276" w:lineRule="auto"/>
+      </w:pPr>
+      <w:r>
+        <w:rPr>
+          <w:sz w:val="22"/>
+          <w:szCs w:val="22"/>
+        </w:rPr>
+        <w:t xml:space="preserve">A apresentação do recurso administrativo </w:t>
+      </w:r>
+      <w:r>
+        <w:rPr>
+          <w:b/>
+          <w:sz w:val="22"/>
+          <w:szCs w:val="22"/>
+        </w:rPr>
+        <w:t xml:space="preserve">não garante a reforma do indeferimento ou a concessão do registro da marca</w:t>
+      </w:r>
+      <w:r>
+        <w:rPr>
+          <w:sz w:val="22"/>
+          <w:szCs w:val="22"/>
+        </w:rPr>
+        <w:t xml:space="preserve">, uma vez que o julgamento compete exclusivamente ao Instituto Nacional da Propriedade Industrial – INPI.</w:t>
       </w:r>
     </w:p>
     <w:p>
@@ -1167,34 +1768,34 @@
           <w:sz w:val="22"/>
           <w:szCs w:val="22"/>
         </w:rPr>
-        <w:t xml:space="preserve">Os honorários contratados serão devidos independentemente do resultado final do processo, desde que os serviços contratados tenham sido regularmente prestados pela CONTRATADA.</w:t>
-      </w:r>
-    </w:p>
-    <w:p>
-      <w:pPr>
-        <w:jc w:val="both"/>
-        <w:spacing w:after="90" w:line="276" w:lineRule="auto"/>
-      </w:pPr>
-      <w:r>
-        <w:rPr>
-          <w:b/>
-          <w:sz w:val="22"/>
-          <w:szCs w:val="22"/>
-        </w:rPr>
-        <w:t xml:space="preserve">6.2. Decisão do INPI</w:t>
-      </w:r>
-    </w:p>
-    <w:p>
-      <w:pPr>
-        <w:jc w:val="both"/>
-        <w:spacing w:after="90" w:line="276" w:lineRule="auto"/>
-      </w:pPr>
-      <w:r>
-        <w:rPr>
-          <w:sz w:val="22"/>
-          <w:szCs w:val="22"/>
-        </w:rPr>
-        <w:t xml:space="preserve">A CONTRATANTE reconhece que o INPI poderá, de acordo com sua análise técnica e jurídica, manter ou reformar a decisão de indeferimento, total ou parcialmente, independentemente dos argumentos apresentados no recurso.</w:t>
+        <w:t xml:space="preserve">Os honorários serão devidos independentemente do resultado final, desde que os serviços contratados tenham sido regularmente prestados pela CONTRATADA.</w:t>
+      </w:r>
+    </w:p>
+    <w:p>
+      <w:pPr>
+        <w:jc w:val="both"/>
+        <w:spacing w:after="90" w:line="276" w:lineRule="auto"/>
+      </w:pPr>
+      <w:r>
+        <w:rPr>
+          <w:b/>
+          <w:sz w:val="22"/>
+          <w:szCs w:val="22"/>
+        </w:rPr>
+        <w:t xml:space="preserve">6.2. Análise administrativa</w:t>
+      </w:r>
+    </w:p>
+    <w:p>
+      <w:pPr>
+        <w:jc w:val="both"/>
+        <w:spacing w:after="90" w:line="276" w:lineRule="auto"/>
+      </w:pPr>
+      <w:r>
+        <w:rPr>
+          <w:sz w:val="22"/>
+          <w:szCs w:val="22"/>
+        </w:rPr>
+        <w:t xml:space="preserve">A CONTRATANTE declara compreender que, durante a análise do recurso, o INPI poderá avaliar os argumentos apresentados, documentos existentes no processo e demais circunstâncias consideradas relevantes para a decisão administrativa.</w:t>
       </w:r>
     </w:p>
     <w:p>
@@ -1207,21 +1808,61 @@
           <w:sz w:val="22"/>
           <w:szCs w:val="22"/>
         </w:rPr>
-        <w:t xml:space="preserve">Eventual decisão desfavorável não caracteriza, por si só, falha na prestação dos serviços contratados.</w:t>
-      </w:r>
-    </w:p>
-    <w:p>
-      <w:pPr>
-        <w:jc w:val="both"/>
-        <w:spacing w:after="90" w:line="276" w:lineRule="auto"/>
-      </w:pPr>
-      <w:r>
-        <w:rPr>
-          <w:b/>
-          <w:sz w:val="22"/>
-          <w:szCs w:val="22"/>
-        </w:rPr>
-        <w:t xml:space="preserve">6.3. Confidencialidade</w:t>
+        <w:t xml:space="preserve">Eventual manutenção do indeferimento não caracteriza, isoladamente, falha na prestação dos serviços profissionais.</w:t>
+      </w:r>
+    </w:p>
+    <w:p>
+      <w:pPr>
+        <w:jc w:val="both"/>
+        <w:spacing w:after="90" w:line="276" w:lineRule="auto"/>
+      </w:pPr>
+      <w:r>
+        <w:rPr>
+          <w:b/>
+          <w:sz w:val="22"/>
+          <w:szCs w:val="22"/>
+        </w:rPr>
+        <w:t xml:space="preserve">6.3. Fatos supervenientes</w:t>
+      </w:r>
+    </w:p>
+    <w:p>
+      <w:pPr>
+        <w:jc w:val="both"/>
+        <w:spacing w:after="90" w:line="276" w:lineRule="auto"/>
+      </w:pPr>
+      <w:r>
+        <w:rPr>
+          <w:sz w:val="22"/>
+          <w:szCs w:val="22"/>
+        </w:rPr>
+        <w:t xml:space="preserve">Caso surjam, durante a tramitação do recurso, fatos, documentos, alterações de titularidade de marcas anteriores, extinção de anterioridades ou outras circunstâncias capazes de influenciar o julgamento, a CONTRATADA poderá orientar a CONTRATANTE quanto às medidas administrativas eventualmente cabíveis.</w:t>
+      </w:r>
+    </w:p>
+    <w:p>
+      <w:pPr>
+        <w:jc w:val="both"/>
+        <w:spacing w:after="160" w:line="276" w:lineRule="auto"/>
+      </w:pPr>
+      <w:r>
+        <w:rPr>
+          <w:sz w:val="22"/>
+          <w:szCs w:val="22"/>
+        </w:rPr>
+        <w:t xml:space="preserve">Quando tais medidas demandarem novo serviço técnico não abrangido pelo objeto deste contrato, será apresentado orçamento específico antes de sua realização.</w:t>
+      </w:r>
+    </w:p>
+    <w:p>
+      <w:pPr>
+        <w:jc w:val="both"/>
+        <w:spacing w:after="90" w:line="276" w:lineRule="auto"/>
+      </w:pPr>
+      <w:r>
+        <w:rPr>
+          <w:b/>
+          <w:sz w:val="22"/>
+          <w:szCs w:val="22"/>
+        </w:rPr>
+        <w:t xml:space="preserve">6.4. Confidencialidade</w:t>
       </w:r>
     </w:p>
     <w:p>
@@ -1234,21 +1875,21 @@
           <w:sz w:val="22"/>
           <w:szCs w:val="22"/>
         </w:rPr>
-        <w:t xml:space="preserve">Nenhuma das Partes poderá revelar ou permitir a divulgação de informações confidenciais relacionadas a este contrato ou aos documentos fornecidos em razão desta contratação, exceto:</w:t>
-      </w:r>
-    </w:p>
-    <w:p>
-      <w:pPr>
-        <w:jc w:val="both"/>
-        <w:ind w:left="340"/>
-        <w:spacing w:after="90" w:line="276" w:lineRule="auto"/>
-      </w:pPr>
-      <w:r>
-        <w:rPr>
-          <w:sz w:val="22"/>
-          <w:szCs w:val="22"/>
-        </w:rPr>
-        <w:t xml:space="preserve">a) para execução dos serviços previstos neste contrato;</w:t>
+        <w:t xml:space="preserve">Nenhuma das Partes poderá revelar ou permitir a divulgação de informações confidenciais relacionadas a este contrato ou aos documentos fornecidos em razão desta contratação, salvo:</w:t>
+      </w:r>
+    </w:p>
+    <w:p>
+      <w:pPr>
+        <w:jc w:val="both"/>
+        <w:ind w:left="340"/>
+        <w:spacing w:after="90" w:line="276" w:lineRule="auto"/>
+      </w:pPr>
+      <w:r>
+        <w:rPr>
+          <w:sz w:val="22"/>
+          <w:szCs w:val="22"/>
+        </w:rPr>
+        <w:t xml:space="preserve">a) para execução dos serviços contratados;</w:t>
       </w:r>
     </w:p>
     <w:p>
@@ -1290,20 +1931,20 @@
           <w:sz w:val="22"/>
           <w:szCs w:val="22"/>
         </w:rPr>
-        <w:t xml:space="preserve">6.4. Serviços adicionais</w:t>
-      </w:r>
-    </w:p>
-    <w:p>
-      <w:pPr>
-        <w:jc w:val="both"/>
-        <w:spacing w:after="90" w:line="276" w:lineRule="auto"/>
-      </w:pPr>
-      <w:r>
-        <w:rPr>
-          <w:sz w:val="22"/>
-          <w:szCs w:val="22"/>
-        </w:rPr>
-        <w:t xml:space="preserve">Quaisquer serviços não expressamente contemplados neste contrato dependerão de nova contratação entre as Partes.</w:t>
+        <w:t xml:space="preserve">6.5. Serviços adicionais</w:t>
+      </w:r>
+    </w:p>
+    <w:p>
+      <w:pPr>
+        <w:jc w:val="both"/>
+        <w:spacing w:after="90" w:line="276" w:lineRule="auto"/>
+      </w:pPr>
+      <w:r>
+        <w:rPr>
+          <w:sz w:val="22"/>
+          <w:szCs w:val="22"/>
+        </w:rPr>
+        <w:t xml:space="preserve">Quaisquer serviços não expressamente previstos neste instrumento dependerão de nova contratação.</w:t>
       </w:r>
     </w:p>
     <w:p>
@@ -1316,21 +1957,21 @@
           <w:sz w:val="22"/>
           <w:szCs w:val="22"/>
         </w:rPr>
-        <w:t xml:space="preserve">A eventual prestação de serviço adicional pela CONTRATADA não implicará novação, alteração automática do objeto ou renúncia às condições previstas neste instrumento.</w:t>
-      </w:r>
-    </w:p>
-    <w:p>
-      <w:pPr>
-        <w:jc w:val="both"/>
-        <w:spacing w:after="90" w:line="276" w:lineRule="auto"/>
-      </w:pPr>
-      <w:r>
-        <w:rPr>
-          <w:b/>
-          <w:sz w:val="22"/>
-          <w:szCs w:val="22"/>
-        </w:rPr>
-        <w:t xml:space="preserve">6.5. Alterações contratuais</w:t>
+        <w:t xml:space="preserve">A eventual prestação pontual de serviço adicional não implicará alteração automática do objeto deste contrato.</w:t>
+      </w:r>
+    </w:p>
+    <w:p>
+      <w:pPr>
+        <w:jc w:val="both"/>
+        <w:spacing w:after="90" w:line="276" w:lineRule="auto"/>
+      </w:pPr>
+      <w:r>
+        <w:rPr>
+          <w:b/>
+          <w:sz w:val="22"/>
+          <w:szCs w:val="22"/>
+        </w:rPr>
+        <w:t xml:space="preserve">6.6. Alterações contratuais</w:t>
       </w:r>
     </w:p>
     <w:p>
@@ -1357,7 +1998,7 @@
           <w:sz w:val="22"/>
           <w:szCs w:val="22"/>
         </w:rPr>
-        <w:t xml:space="preserve">6.6. Invalidade parcial</w:t>
+        <w:t xml:space="preserve">6.7. Invalidade parcial</w:t>
       </w:r>
     </w:p>
     <w:p>
@@ -1370,21 +2011,21 @@
           <w:sz w:val="22"/>
           <w:szCs w:val="22"/>
         </w:rPr>
-        <w:t xml:space="preserve">A eventual invalidade ou inexequibilidade de qualquer cláusula deste contrato não prejudicará as demais disposições, que permanecerão válidas e eficazes naquilo que forem juridicamente independentes.</w:t>
-      </w:r>
-    </w:p>
-    <w:p>
-      <w:pPr>
-        <w:jc w:val="both"/>
-        <w:spacing w:after="90" w:line="276" w:lineRule="auto"/>
-      </w:pPr>
-      <w:r>
-        <w:rPr>
-          <w:b/>
-          <w:sz w:val="22"/>
-          <w:szCs w:val="22"/>
-        </w:rPr>
-        <w:t xml:space="preserve">6.7. Ausência de vínculo</w:t>
+        <w:t xml:space="preserve">A eventual invalidade ou inexequibilidade de qualquer disposição deste contrato não prejudicará as demais cláusulas, que permanecerão válidas naquilo que forem juridicamente independentes.</w:t>
+      </w:r>
+    </w:p>
+    <w:p>
+      <w:pPr>
+        <w:jc w:val="both"/>
+        <w:spacing w:after="90" w:line="276" w:lineRule="auto"/>
+      </w:pPr>
+      <w:r>
+        <w:rPr>
+          <w:b/>
+          <w:sz w:val="22"/>
+          <w:szCs w:val="22"/>
+        </w:rPr>
+        <w:t xml:space="preserve">6.8. Ausência de vínculo</w:t>
       </w:r>
     </w:p>
     <w:p>
@@ -1397,7 +2038,7 @@
           <w:sz w:val="22"/>
           <w:szCs w:val="22"/>
         </w:rPr>
-        <w:t xml:space="preserve">O presente contrato não estabelece vínculo trabalhista, associativo, societário ou de qualquer outra natureza entre as Partes, respondendo cada uma individualmente pelas obrigações que assumir.</w:t>
+        <w:t xml:space="preserve">Do presente contrato não resulta vínculo trabalhista, associativo, societário, parceria ou solidariedade entre as Partes, respondendo cada uma individualmente pelas obrigações que assumir.</w:t>
       </w:r>
     </w:p>
     <w:p>
@@ -1432,7 +2073,22 @@
           <w:sz w:val="22"/>
           <w:szCs w:val="22"/>
         </w:rPr>
-        <w:t xml:space="preserve"> A CONTRATANTE terá acesso às informações necessárias para acompanhamento do processo nº {{PROCESSO}}, incluindo o número do processo, comprovantes de protocolo, movimentações relevantes e demais informações disponibilizadas pelos sistemas oficiais do INPI.</w:t>
+        <w:t xml:space="preserve"> A CONTRATANTE terá acesso às informações necessárias para acompanhamento do processo nº </w:t>
+      </w:r>
+      <w:r>
+        <w:rPr>
+          <w:b/>
+          <w:sz w:val="22"/>
+          <w:szCs w:val="22"/>
+        </w:rPr>
+        <w:t xml:space="preserve">{{PROCESSO}}</w:t>
+      </w:r>
+      <w:r>
+        <w:rPr>
+          <w:sz w:val="22"/>
+          <w:szCs w:val="22"/>
+        </w:rPr>
+        <w:t xml:space="preserve">, incluindo o número do processo, comprovantes de protocolo, decisões, movimentações relevantes e demais informações disponibilizadas pelos sistemas oficiais do INPI.</w:t>
       </w:r>
     </w:p>
     <w:p>
@@ -1453,7 +2109,22 @@
           <w:sz w:val="22"/>
           <w:szCs w:val="22"/>
         </w:rPr>
-        <w:t xml:space="preserve"> A CONTRATANTE poderá consultar diretamente, a qualquer tempo, as informações públicas disponibilizadas pelo INPI acerca do andamento do processo.</w:t>
+        <w:t xml:space="preserve"> A CONTRATANTE poderá consultar diretamente, </w:t>
+      </w:r>
+      <w:r>
+        <w:rPr>
+          <w:b/>
+          <w:sz w:val="22"/>
+          <w:szCs w:val="22"/>
+        </w:rPr>
+        <w:t xml:space="preserve">a qualquer tempo</w:t>
+      </w:r>
+      <w:r>
+        <w:rPr>
+          <w:sz w:val="22"/>
+          <w:szCs w:val="22"/>
+        </w:rPr>
+        <w:t xml:space="preserve">, as informações públicas disponibilizadas pelo INPI acerca do andamento do processo.</w:t>
       </w:r>
     </w:p>
     <w:p>
@@ -1474,7 +2145,7 @@
           <w:sz w:val="22"/>
           <w:szCs w:val="22"/>
         </w:rPr>
-        <w:t xml:space="preserve"> Quando houver conta ou credenciais de acesso criadas especificamente em nome da CONTRATANTE para utilização dos serviços do INPI, os respectivos dados de acesso permanecerão sob sua titularidade e poderão ser disponibilizados à CONTRATANTE.</w:t>
+        <w:t xml:space="preserve"> Quando houver conta ou credenciais de acesso criadas especificamente em nome da CONTRATANTE para utilização dos serviços do INPI, os respectivos dados permanecerão sob sua titularidade.</w:t>
       </w:r>
     </w:p>
     <w:p>
@@ -1487,7 +2158,7 @@
           <w:sz w:val="22"/>
           <w:szCs w:val="22"/>
         </w:rPr>
-        <w:t xml:space="preserve">Credenciais pessoais ou profissionais de titularidade exclusiva da CONTRATADA, de seus advogados ou colaboradores não integram o objeto deste contrato e não serão compartilhadas, em observância às medidas de segurança e proteção de dados.</w:t>
+        <w:t xml:space="preserve">Credenciais pessoais ou profissionais de titularidade exclusiva da CONTRATADA, seus advogados ou colaboradores não serão compartilhadas.</w:t>
       </w:r>
     </w:p>
     <w:p>
@@ -1508,7 +2179,7 @@
           <w:sz w:val="22"/>
           <w:szCs w:val="22"/>
         </w:rPr>
-        <w:t xml:space="preserve"> A CONTRATADA compromete-se a manter a CONTRATANTE informada acerca das movimentações processuais relevantes identificadas durante o período de acompanhamento contratado.</w:t>
+        <w:t xml:space="preserve"> A CONTRATADA compromete-se a comunicar à CONTRATANTE movimentações relevantes identificadas durante o acompanhamento do recurso.</w:t>
       </w:r>
     </w:p>
     <w:p>
@@ -1529,7 +2200,7 @@
           <w:sz w:val="22"/>
           <w:szCs w:val="22"/>
         </w:rPr>
-        <w:t xml:space="preserve"> O acesso direto da CONTRATANTE ao processo não afasta nem reduz as obrigações de acompanhamento assumidas pela CONTRATADA nos limites deste instrumento.</w:t>
+        <w:t xml:space="preserve"> O acesso direto da CONTRATANTE ao processo não afasta as obrigações de acompanhamento assumidas pela CONTRATADA nos limites deste instrumento.</w:t>
       </w:r>
     </w:p>
     <w:p>
@@ -1564,7 +2235,22 @@
           <w:sz w:val="22"/>
           <w:szCs w:val="22"/>
         </w:rPr>
-        <w:t xml:space="preserve"> Para dirimir quaisquer controvérsias decorrentes deste contrato, as Partes elegem o Foro da Comarca de Lages/SC, com renúncia a qualquer outro, por mais privilegiado que seja, ressalvadas as hipóteses em que a legislação determinar competência diversa.</w:t>
+        <w:t xml:space="preserve"> Para dirimir eventuais controvérsias decorrentes deste contrato, as Partes elegem o </w:t>
+      </w:r>
+      <w:r>
+        <w:rPr>
+          <w:b/>
+          <w:sz w:val="22"/>
+          <w:szCs w:val="22"/>
+        </w:rPr>
+        <w:t xml:space="preserve">Foro da Comarca de Lages/SC</w:t>
+      </w:r>
+      <w:r>
+        <w:rPr>
+          <w:sz w:val="22"/>
+          <w:szCs w:val="22"/>
+        </w:rPr>
+        <w:t xml:space="preserve">, com renúncia a qualquer outro, por mais privilegiado que seja, ressalvadas as hipóteses em que a legislação determinar competência diversa.</w:t>
       </w:r>
     </w:p>
     <w:p>
@@ -1613,6 +2299,7 @@
       </w:pPr>
       <w:r>
         <w:rPr>
+          <w:b/>
           <w:sz w:val="22"/>
           <w:szCs w:val="22"/>
         </w:rPr>
@@ -1706,6 +2393,7 @@
       </w:pPr>
       <w:r>
         <w:rPr>
+          <w:b/>
           <w:sz w:val="22"/>
           <w:szCs w:val="22"/>
         </w:rPr>

</xml_diff>

<commit_message>
documentos: mais respiro antes da linha de assinatura em todos os modelos
24pt entre Representante/OAB/CPF e 'Assinatura:' nos contratos de oposicao
e indeferimento e na procuracao de indeferimento; procuracao de oposicao
ganha o MESMO bloco oficial das demais (Representado(a) por / CPF /
Assinatura) no lugar da linha em cima do nome; procuracao geral com 30pt
antes da linha (contrato geral ja tinha).

Co-Authored-By: Claude Opus 4.8 <noreply@anthropic.com>
</commit_message>
<xml_diff>
--- a/admin/tpl/contrato-indeferimento.docx
+++ b/admin/tpl/contrato-indeferimento.docx
@@ -2336,7 +2336,7 @@
     <w:p>
       <w:pPr>
         <w:jc w:val="center"/>
-        <w:spacing w:after="60" w:line="276" w:lineRule="auto"/>
+        <w:spacing w:after="480" w:line="276" w:lineRule="auto"/>
       </w:pPr>
       <w:r>
         <w:rPr>
@@ -2403,7 +2403,7 @@
     <w:p>
       <w:pPr>
         <w:jc w:val="center"/>
-        <w:spacing w:after="60" w:line="276" w:lineRule="auto"/>
+        <w:spacing w:after="480" w:line="276" w:lineRule="auto"/>
       </w:pPr>
       <w:r>
         <w:rPr>

</xml_diff>

<commit_message>
documentos: respiro antes da assinatura sobe para 40pt em todos os modelos
Co-Authored-By: Claude Opus 4.8 <noreply@anthropic.com>
</commit_message>
<xml_diff>
--- a/admin/tpl/contrato-indeferimento.docx
+++ b/admin/tpl/contrato-indeferimento.docx
@@ -2336,7 +2336,7 @@
     <w:p>
       <w:pPr>
         <w:jc w:val="center"/>
-        <w:spacing w:after="480" w:line="276" w:lineRule="auto"/>
+        <w:spacing w:after="800" w:line="276" w:lineRule="auto"/>
       </w:pPr>
       <w:r>
         <w:rPr>
@@ -2403,7 +2403,7 @@
     <w:p>
       <w:pPr>
         <w:jc w:val="center"/>
-        <w:spacing w:after="480" w:line="276" w:lineRule="auto"/>
+        <w:spacing w:after="800" w:line="276" w:lineRule="auto"/>
       </w:pPr>
       <w:r>
         <w:rPr>

</xml_diff>